<commit_message>
fix(msword): preserve duplicate paragraphs in textboxes by skipping mc:Fallback branch
Signed-off-by: Cesar Berrospi Ramis <ceb@zurich.ibm.com>
</commit_message>
<xml_diff>
--- a/tests/data/docx/sources/textbox.docx
+++ b/tests/data/docx/sources/textbox.docx
@@ -1,6 +1,6 @@
 
 <file path=word/document.xml><?xml version="1.0" encoding="utf-8"?>
-<w:document xmlns:wpc="http://schemas.microsoft.com/office/word/2010/wordprocessingCanvas" xmlns:cx="http://schemas.microsoft.com/office/drawing/2014/chartex" xmlns:cx1="http://schemas.microsoft.com/office/drawing/2015/9/8/chartex" xmlns:cx2="http://schemas.microsoft.com/office/drawing/2015/10/21/chartex" xmlns:cx3="http://schemas.microsoft.com/office/drawing/2016/5/9/chartex" xmlns:cx4="http://schemas.microsoft.com/office/drawing/2016/5/10/chartex" xmlns:cx5="http://schemas.microsoft.com/office/drawing/2016/5/11/chartex" xmlns:cx6="http://schemas.microsoft.com/office/drawing/2016/5/12/chartex" xmlns:cx7="http://schemas.microsoft.com/office/drawing/2016/5/13/chartex" xmlns:cx8="http://schemas.microsoft.com/office/drawing/2016/5/14/chartex" xmlns:mc="http://schemas.openxmlformats.org/markup-compatibility/2006" xmlns:aink="http://schemas.microsoft.com/office/drawing/2016/ink" xmlns:am3d="http://schemas.microsoft.com/office/drawing/2017/model3d" xmlns:o="urn:schemas-microsoft-com:office:office" xmlns:oel="http://schemas.microsoft.com/office/2019/extlst" xmlns:r="http://schemas.openxmlformats.org/officeDocument/2006/relationships" xmlns:m="http://schemas.openxmlformats.org/officeDocument/2006/math" xmlns:v="urn:schemas-microsoft-com:vml" xmlns:wp14="http://schemas.microsoft.com/office/word/2010/wordprocessingDrawing" xmlns:wp="http://schemas.openxmlformats.org/drawingml/2006/wordprocessingDrawing" xmlns:w10="urn:schemas-microsoft-com:office:word" xmlns:w="http://schemas.openxmlformats.org/wordprocessingml/2006/main" xmlns:w14="http://schemas.microsoft.com/office/word/2010/wordml" xmlns:w15="http://schemas.microsoft.com/office/word/2012/wordml" xmlns:w16cex="http://schemas.microsoft.com/office/word/2018/wordml/cex" xmlns:w16cid="http://schemas.microsoft.com/office/word/2016/wordml/cid" xmlns:w16="http://schemas.microsoft.com/office/word/2018/wordml" xmlns:w16du="http://schemas.microsoft.com/office/word/2023/wordml/word16du" xmlns:w16sdtdh="http://schemas.microsoft.com/office/word/2020/wordml/sdtdatahash" xmlns:w16sdtfl="http://schemas.microsoft.com/office/word/2024/wordml/sdtformatlock" xmlns:w16se="http://schemas.microsoft.com/office/word/2015/wordml/symex" xmlns:wpg="http://schemas.microsoft.com/office/word/2010/wordprocessingGroup" xmlns:wpi="http://schemas.microsoft.com/office/word/2010/wordprocessingInk" xmlns:wne="http://schemas.microsoft.com/office/word/2006/wordml" xmlns:wps="http://schemas.microsoft.com/office/word/2010/wordprocessingShape" mc:Ignorable="w14 w15 w16se w16cid w16 w16cex w16sdtdh w16sdtfl w16du wp14">
+<w:document xmlns:wpc="http://schemas.microsoft.com/office/word/2010/wordprocessingCanvas" xmlns:cx="http://schemas.microsoft.com/office/drawing/2014/chartex" xmlns:cx1="http://schemas.microsoft.com/office/drawing/2015/9/8/chartex" xmlns:cx2="http://schemas.microsoft.com/office/drawing/2015/10/21/chartex" xmlns:cx3="http://schemas.microsoft.com/office/drawing/2016/5/9/chartex" xmlns:cx4="http://schemas.microsoft.com/office/drawing/2016/5/10/chartex" xmlns:cx5="http://schemas.microsoft.com/office/drawing/2016/5/11/chartex" xmlns:cx6="http://schemas.microsoft.com/office/drawing/2016/5/12/chartex" xmlns:cx7="http://schemas.microsoft.com/office/drawing/2016/5/13/chartex" xmlns:cx8="http://schemas.microsoft.com/office/drawing/2016/5/14/chartex" xmlns:mc="http://schemas.openxmlformats.org/markup-compatibility/2006" xmlns:m="http://schemas.openxmlformats.org/officeDocument/2006/math" xmlns:aink="http://schemas.microsoft.com/office/drawing/2016/ink" xmlns:am3d="http://schemas.microsoft.com/office/drawing/2017/model3d" xmlns:oel="http://schemas.microsoft.com/office/2019/extlst" xmlns:r="http://schemas.openxmlformats.org/officeDocument/2006/relationships" xmlns:wp14="http://schemas.microsoft.com/office/word/2010/wordprocessingDrawing" xmlns:wp="http://schemas.openxmlformats.org/drawingml/2006/wordprocessingDrawing" xmlns:wpg="http://schemas.microsoft.com/office/word/2010/wordprocessingGroup" xmlns:wpi="http://schemas.microsoft.com/office/word/2010/wordprocessingInk" xmlns:wps="http://schemas.microsoft.com/office/word/2010/wordprocessingShape" xmlns:o="urn:schemas-microsoft-com:office:office" xmlns:v="urn:schemas-microsoft-com:vml" xmlns:w10="urn:schemas-microsoft-com:office:word" xmlns:w="http://schemas.openxmlformats.org/wordprocessingml/2006/main" xmlns:w14="http://schemas.microsoft.com/office/word/2010/wordml" xmlns:w15="http://schemas.microsoft.com/office/word/2012/wordml" xmlns:w16cex="http://schemas.microsoft.com/office/word/2018/wordml/cex" xmlns:w16cid="http://schemas.microsoft.com/office/word/2016/wordml/cid" xmlns:w16="http://schemas.microsoft.com/office/word/2018/wordml" xmlns:w16sdtdh="http://schemas.microsoft.com/office/word/2020/wordml/sdtdatahash" xmlns:w16sdtfl="http://schemas.microsoft.com/office/word/2024/wordml/sdtformatlock" xmlns:w16se="http://schemas.microsoft.com/office/word/2015/wordml/symex" xmlns:w16du="http://schemas.microsoft.com/office/word/2023/wordml/word16du" xmlns:wne="http://schemas.microsoft.com/office/word/2006/wordml" mc:Ignorable="w14 w15 w16se w16cid w16 w16cex w16sdtdh w16sdtfl w16du wp14">
   <w:body>
     <w:p>
       <w:pPr>
@@ -17,25 +17,7 @@
           <w:b/>
           <w:bCs/>
         </w:rPr>
-        <w:t xml:space="preserve">Chiayi County </w:t>
-      </w:r>
-      <w:proofErr w:type="spellStart"/>
-      <w:r>
-        <w:rPr>
-          <w:rFonts w:eastAsia="DFKai-SB"/>
-          <w:b/>
-          <w:bCs/>
-        </w:rPr>
-        <w:t>Shuishang</w:t>
-      </w:r>
-      <w:proofErr w:type="spellEnd"/>
-      <w:r>
-        <w:rPr>
-          <w:rFonts w:eastAsia="DFKai-SB"/>
-          <w:b/>
-          <w:bCs/>
-        </w:rPr>
-        <w:t xml:space="preserve"> Township Nanjing Elementary School Affiliated Kindergarten</w:t>
+        <w:t>Chiayi County Shuishang Township Nanjing Elementary School Affiliated Kindergarten</w:t>
       </w:r>
     </w:p>
     <w:p>
@@ -116,7 +98,6 @@
                               <w:rPr>
                                 <w:rFonts w:eastAsia="Times New Roman"/>
                                 <w:kern w:val="0"/>
-                                <w:lang/>
                               </w:rPr>
                             </w:pPr>
                             <w:r>
@@ -125,7 +106,6 @@
                                 <w:b/>
                                 <w:bCs/>
                                 <w:kern w:val="0"/>
-                                <w:lang/>
                               </w:rPr>
                               <w:t>Student falls il</w:t>
                             </w:r>
@@ -135,7 +115,6 @@
                                 <w:b/>
                                 <w:bCs/>
                                 <w:kern w:val="0"/>
-                                <w:lang/>
                               </w:rPr>
                               <w:t>l</w:t>
                             </w:r>
@@ -1011,14 +990,12 @@
                               <w:rPr>
                                 <w:rFonts w:eastAsia="Times New Roman"/>
                                 <w:kern w:val="0"/>
-                                <w:lang/>
                               </w:rPr>
                             </w:pPr>
                             <w:r>
                               <w:rPr>
                                 <w:rFonts w:eastAsia="Times New Roman"/>
                                 <w:kern w:val="0"/>
-                                <w:lang/>
                               </w:rPr>
                               <w:t>A report must be submitted within 24 hours via the Ministry of Education’s Campus Safety and Disaster Prevention Information Network.</w:t>
                             </w:r>
@@ -1035,14 +1012,12 @@
                               <w:rPr>
                                 <w:rFonts w:eastAsia="Times New Roman"/>
                                 <w:kern w:val="0"/>
-                                <w:lang/>
                               </w:rPr>
                             </w:pPr>
                             <w:r>
                               <w:rPr>
                                 <w:rFonts w:eastAsia="Times New Roman"/>
                                 <w:kern w:val="0"/>
-                                <w:lang/>
                               </w:rPr>
                               <w:t>A report must also be submitted within 48 hours through Chiayi County’s School Suspected Infectious Disease Reporting System.</w:t>
                             </w:r>
@@ -1053,7 +1028,6 @@
                                 <w:rFonts w:ascii="DFKai-SB" w:eastAsia="DFKai-SB" w:hAnsi="DFKai-SB"/>
                                 <w:sz w:val="20"/>
                                 <w:szCs w:val="20"/>
-                                <w:lang/>
                               </w:rPr>
                             </w:pPr>
                           </w:p>
@@ -1292,7 +1266,6 @@
                               <w:rPr>
                                 <w:rFonts w:eastAsia="Times New Roman"/>
                                 <w:kern w:val="0"/>
-                                <w:lang/>
                               </w:rPr>
                             </w:pPr>
                             <w:r>
@@ -1301,7 +1274,6 @@
                                 <w:b/>
                                 <w:bCs/>
                                 <w:kern w:val="0"/>
-                                <w:lang/>
                               </w:rPr>
                               <w:t>Health Bureau:</w:t>
                             </w:r>
@@ -1313,14 +1285,12 @@
                               <w:rPr>
                                 <w:rFonts w:eastAsia="Times New Roman"/>
                                 <w:kern w:val="0"/>
-                                <w:lang/>
                               </w:rPr>
                             </w:pPr>
                             <w:r>
                               <w:rPr>
                                 <w:rFonts w:eastAsia="Times New Roman"/>
                                 <w:kern w:val="0"/>
-                                <w:lang/>
                               </w:rPr>
                               <w:t>Upon receiving a report from the kindergarten, conduct a preliminary assessment of the case, and depending on the situation and type of illness, carry out an epidemiological investigation and report to the Centers for Disease Control.</w:t>
                             </w:r>
@@ -1336,14 +1306,12 @@
                               <w:rPr>
                                 <w:rFonts w:eastAsia="Times New Roman"/>
                                 <w:kern w:val="0"/>
-                                <w:lang/>
                               </w:rPr>
                             </w:pPr>
                             <w:r>
                               <w:rPr>
                                 <w:rFonts w:eastAsia="Times New Roman"/>
                                 <w:kern w:val="0"/>
-                                <w:lang/>
                               </w:rPr>
                               <w:t>If necessary, provide health education and important reminders at the kindergarten, or notify the individual to undergo specimen collection.</w:t>
                             </w:r>
@@ -1359,14 +1327,12 @@
                               <w:rPr>
                                 <w:rFonts w:eastAsia="Times New Roman"/>
                                 <w:kern w:val="0"/>
-                                <w:lang/>
                               </w:rPr>
                             </w:pPr>
                             <w:r>
                               <w:rPr>
                                 <w:rFonts w:eastAsia="Times New Roman"/>
                                 <w:kern w:val="0"/>
-                                <w:lang/>
                               </w:rPr>
                               <w:t>Implement appropriate epidemic prevention measures in accordance with the Communicable Disease Control Act.</w:t>
                             </w:r>
@@ -1375,7 +1341,6 @@
                             <w:pPr>
                               <w:rPr>
                                 <w:rFonts w:ascii="DFKai-SB" w:eastAsia="DFKai-SB" w:hAnsi="DFKai-SB"/>
-                                <w:lang/>
                               </w:rPr>
                             </w:pPr>
                           </w:p>
@@ -1767,14 +1732,12 @@
                               <w:rPr>
                                 <w:rFonts w:eastAsia="Times New Roman"/>
                                 <w:kern w:val="0"/>
-                                <w:lang/>
                               </w:rPr>
                             </w:pPr>
                             <w:r>
                               <w:rPr>
                                 <w:rFonts w:eastAsia="Times New Roman"/>
                                 <w:kern w:val="0"/>
-                                <w:lang/>
                               </w:rPr>
                               <w:t xml:space="preserve">The Health Bureau will handle </w:t>
                             </w:r>
@@ -1784,7 +1747,6 @@
                                 <w:b/>
                                 <w:bCs/>
                                 <w:kern w:val="0"/>
-                                <w:lang/>
                               </w:rPr>
                               <w:t>reporting and specimen collection</w:t>
                             </w:r>
@@ -1792,7 +1754,6 @@
                               <w:rPr>
                                 <w:rFonts w:eastAsia="Times New Roman"/>
                                 <w:kern w:val="0"/>
-                                <w:lang/>
                               </w:rPr>
                               <w:t>.</w:t>
                             </w:r>
@@ -2016,7 +1977,6 @@
                               <w:rPr>
                                 <w:rFonts w:eastAsia="Times New Roman"/>
                                 <w:kern w:val="0"/>
-                                <w:lang/>
                               </w:rPr>
                             </w:pPr>
                             <w:r>
@@ -2025,7 +1985,6 @@
                                 <w:b/>
                                 <w:bCs/>
                                 <w:kern w:val="0"/>
-                                <w:lang/>
                               </w:rPr>
                               <w:t>Whether the epidemic has eased.</w:t>
                             </w:r>
@@ -2155,7 +2114,6 @@
                               <w:rPr>
                                 <w:rFonts w:eastAsia="Times New Roman"/>
                                 <w:kern w:val="0"/>
-                                <w:lang/>
                               </w:rPr>
                             </w:pPr>
                             <w:r>
@@ -2164,7 +2122,6 @@
                                 <w:b/>
                                 <w:bCs/>
                                 <w:kern w:val="0"/>
-                                <w:lang/>
                               </w:rPr>
                               <w:t>Whether the test results are positive for a legally designated infectious disease.</w:t>
                             </w:r>
@@ -2903,7 +2860,6 @@
                               <w:rPr>
                                 <w:rFonts w:eastAsia="Times New Roman"/>
                                 <w:kern w:val="0"/>
-                                <w:lang/>
                               </w:rPr>
                             </w:pPr>
                             <w:r>
@@ -2912,7 +2868,6 @@
                                 <w:b/>
                                 <w:bCs/>
                                 <w:kern w:val="0"/>
-                                <w:lang/>
                               </w:rPr>
                               <w:t>Case closed.</w:t>
                             </w:r>
@@ -3312,6 +3267,143 @@
     </w:p>
     <w:p>
       <w:pPr>
+        <w:widowControl/>
+        <w:rPr>
+          <w:rFonts w:ascii="DFKai-SB" w:eastAsia="DFKai-SB" w:hAnsi="DFKai-SB"/>
+          <w:sz w:val="34"/>
+          <w:szCs w:val="34"/>
+        </w:rPr>
+      </w:pPr>
+      <w:r>
+        <w:rPr>
+          <w:rFonts w:ascii="DFKai-SB" w:eastAsia="DFKai-SB" w:hAnsi="DFKai-SB"/>
+          <w:sz w:val="34"/>
+          <w:szCs w:val="34"/>
+        </w:rPr>
+        <w:br w:type="page"/>
+      </w:r>
+    </w:p>
+    <w:p>
+      <w:r>
+        <w:rPr>
+          <w:noProof/>
+        </w:rPr>
+        <w:lastRenderedPageBreak/>
+        <mc:AlternateContent>
+          <mc:Choice Requires="wps">
+            <w:drawing>
+              <wp:anchor distT="0" distB="0" distL="114300" distR="114300" simplePos="0" relativeHeight="251678720" behindDoc="0" locked="0" layoutInCell="1" allowOverlap="1" wp14:anchorId="1B357CA6" wp14:editId="6DFBBB6D">
+                <wp:simplePos x="0" y="0"/>
+                <wp:positionH relativeFrom="column">
+                  <wp:posOffset>370205</wp:posOffset>
+                </wp:positionH>
+                <wp:positionV relativeFrom="paragraph">
+                  <wp:posOffset>370205</wp:posOffset>
+                </wp:positionV>
+                <wp:extent cx="4445000" cy="1270000"/>
+                <wp:effectExtent l="0" t="0" r="12700" b="25400"/>
+                <wp:wrapNone/>
+                <wp:docPr id="913353322" name="Zone de texte 1"/>
+                <wp:cNvGraphicFramePr/>
+                <a:graphic xmlns:a="http://schemas.openxmlformats.org/drawingml/2006/main">
+                  <a:graphicData uri="http://schemas.microsoft.com/office/word/2010/wordprocessingShape">
+                    <wps:wsp>
+                      <wps:cNvSpPr txBox="1"/>
+                      <wps:spPr>
+                        <a:xfrm>
+                          <a:off x="0" y="0"/>
+                          <a:ext cx="4445000" cy="1270000"/>
+                        </a:xfrm>
+                        <a:prstGeom prst="rect">
+                          <a:avLst/>
+                        </a:prstGeom>
+                        <a:noFill/>
+                        <a:ln w="6350">
+                          <a:solidFill>
+                            <a:prstClr val="black"/>
+                          </a:solidFill>
+                        </a:ln>
+                      </wps:spPr>
+                      <wps:txbx>
+                        <w:txbxContent>
+                          <w:p>
+                            <w:r>
+                              <w:t>SAME_LINE_INSIDE_BOX</w:t>
+                            </w:r>
+                          </w:p>
+                          <w:p>
+                            <w:r>
+                              <w:t>MIDDLE_DIFFERENT_LINE</w:t>
+                            </w:r>
+                          </w:p>
+                          <w:p>
+                            <w:r>
+                              <w:t>SAME_LINE_INSIDE_BOX</w:t>
+                            </w:r>
+                          </w:p>
+                        </w:txbxContent>
+                      </wps:txbx>
+                      <wps:bodyPr rot="0" spcFirstLastPara="0" vertOverflow="overflow" horzOverflow="overflow" vert="horz" wrap="square" lIns="91440" tIns="45720" rIns="91440" bIns="45720" numCol="1" spcCol="0" rtlCol="0" fromWordArt="0" anchor="t" anchorCtr="0" forceAA="0" compatLnSpc="1">
+                        <a:prstTxWarp prst="textNoShape">
+                          <a:avLst/>
+                        </a:prstTxWarp>
+                        <a:noAutofit/>
+                      </wps:bodyPr>
+                    </wps:wsp>
+                  </a:graphicData>
+                </a:graphic>
+              </wp:anchor>
+            </w:drawing>
+          </mc:Choice>
+          <mc:Fallback>
+            <w:pict>
+              <v:shapetype w14:anchorId="1B357CA6" id="_x0000_t202" coordsize="21600,21600" o:spt="202" path="m,l,21600r21600,l21600,xe">
+                <v:stroke joinstyle="miter"/>
+                <v:path gradientshapeok="t" o:connecttype="rect"/>
+              </v:shapetype>
+              <v:shape id="Zone de texte 1" o:spid="_x0000_s1042" type="#_x0000_t202" style="position:absolute;margin-left:29.15pt;margin-top:29.15pt;width:350pt;height:100pt;z-index:251678720;visibility:visible;mso-wrap-style:square;mso-wrap-distance-left:9pt;mso-wrap-distance-top:0;mso-wrap-distance-right:9pt;mso-wrap-distance-bottom:0;mso-position-horizontal:absolute;mso-position-horizontal-relative:text;mso-position-vertical:absolute;mso-position-vertical-relative:text;v-text-anchor:top" o:gfxdata="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" filled="f" strokeweight=".5pt">
+                <v:textbox>
+                  <w:txbxContent>
+                    <w:p>
+                      <w:r>
+                        <w:t>SAME_LINE_INSIDE_BOX</w:t>
+                      </w:r>
+                    </w:p>
+                    <w:p>
+                      <w:r>
+                        <w:t>MIDDLE_DIFFERENT_LINE</w:t>
+                      </w:r>
+                    </w:p>
+                    <w:p>
+                      <w:r>
+                        <w:t>SAME_LINE_INSIDE_BOX</w:t>
+                      </w:r>
+                    </w:p>
+                  </w:txbxContent>
+                </v:textbox>
+              </v:shape>
+            </w:pict>
+          </mc:Fallback>
+        </mc:AlternateContent>
+      </w:r>
+      <w:r>
+        <w:t>Body paragraph before textbox</w:t>
+      </w:r>
+    </w:p>
+    <w:p/>
+    <w:p/>
+    <w:p/>
+    <w:p/>
+    <w:p/>
+    <w:p/>
+    <w:p/>
+    <w:p>
+      <w:r>
+        <w:t>Body paragraph after textbox</w:t>
+      </w:r>
+    </w:p>
+    <w:p>
+      <w:pPr>
         <w:rPr>
           <w:rFonts w:ascii="DFKai-SB" w:eastAsia="DFKai-SB" w:hAnsi="DFKai-SB"/>
           <w:sz w:val="34"/>
@@ -3330,7 +3422,7 @@
 </file>
 
 <file path=word/numbering.xml><?xml version="1.0" encoding="utf-8"?>
-<w:numbering xmlns:wpc="http://schemas.microsoft.com/office/word/2010/wordprocessingCanvas" xmlns:cx="http://schemas.microsoft.com/office/drawing/2014/chartex" xmlns:cx1="http://schemas.microsoft.com/office/drawing/2015/9/8/chartex" xmlns:cx2="http://schemas.microsoft.com/office/drawing/2015/10/21/chartex" xmlns:cx3="http://schemas.microsoft.com/office/drawing/2016/5/9/chartex" xmlns:cx4="http://schemas.microsoft.com/office/drawing/2016/5/10/chartex" xmlns:cx5="http://schemas.microsoft.com/office/drawing/2016/5/11/chartex" xmlns:cx6="http://schemas.microsoft.com/office/drawing/2016/5/12/chartex" xmlns:cx7="http://schemas.microsoft.com/office/drawing/2016/5/13/chartex" xmlns:cx8="http://schemas.microsoft.com/office/drawing/2016/5/14/chartex" xmlns:mc="http://schemas.openxmlformats.org/markup-compatibility/2006" xmlns:aink="http://schemas.microsoft.com/office/drawing/2016/ink" xmlns:am3d="http://schemas.microsoft.com/office/drawing/2017/model3d" xmlns:o="urn:schemas-microsoft-com:office:office" xmlns:oel="http://schemas.microsoft.com/office/2019/extlst" xmlns:r="http://schemas.openxmlformats.org/officeDocument/2006/relationships" xmlns:m="http://schemas.openxmlformats.org/officeDocument/2006/math" xmlns:v="urn:schemas-microsoft-com:vml" xmlns:wp14="http://schemas.microsoft.com/office/word/2010/wordprocessingDrawing" xmlns:wp="http://schemas.openxmlformats.org/drawingml/2006/wordprocessingDrawing" xmlns:w10="urn:schemas-microsoft-com:office:word" xmlns:w="http://schemas.openxmlformats.org/wordprocessingml/2006/main" xmlns:w14="http://schemas.microsoft.com/office/word/2010/wordml" xmlns:w15="http://schemas.microsoft.com/office/word/2012/wordml" xmlns:w16cex="http://schemas.microsoft.com/office/word/2018/wordml/cex" xmlns:w16cid="http://schemas.microsoft.com/office/word/2016/wordml/cid" xmlns:w16="http://schemas.microsoft.com/office/word/2018/wordml" xmlns:w16du="http://schemas.microsoft.com/office/word/2023/wordml/word16du" xmlns:w16sdtdh="http://schemas.microsoft.com/office/word/2020/wordml/sdtdatahash" xmlns:w16sdtfl="http://schemas.microsoft.com/office/word/2024/wordml/sdtformatlock" xmlns:w16se="http://schemas.microsoft.com/office/word/2015/wordml/symex" xmlns:wpg="http://schemas.microsoft.com/office/word/2010/wordprocessingGroup" xmlns:wpi="http://schemas.microsoft.com/office/word/2010/wordprocessingInk" xmlns:wne="http://schemas.microsoft.com/office/word/2006/wordml" xmlns:wps="http://schemas.microsoft.com/office/word/2010/wordprocessingShape" mc:Ignorable="w14 w15 w16se w16cid w16 w16cex w16sdtdh w16sdtfl w16du wp14">
+<w:numbering xmlns:wpc="http://schemas.microsoft.com/office/word/2010/wordprocessingCanvas" xmlns:cx="http://schemas.microsoft.com/office/drawing/2014/chartex" xmlns:cx1="http://schemas.microsoft.com/office/drawing/2015/9/8/chartex" xmlns:cx2="http://schemas.microsoft.com/office/drawing/2015/10/21/chartex" xmlns:cx3="http://schemas.microsoft.com/office/drawing/2016/5/9/chartex" xmlns:cx4="http://schemas.microsoft.com/office/drawing/2016/5/10/chartex" xmlns:cx5="http://schemas.microsoft.com/office/drawing/2016/5/11/chartex" xmlns:cx6="http://schemas.microsoft.com/office/drawing/2016/5/12/chartex" xmlns:cx7="http://schemas.microsoft.com/office/drawing/2016/5/13/chartex" xmlns:cx8="http://schemas.microsoft.com/office/drawing/2016/5/14/chartex" xmlns:mc="http://schemas.openxmlformats.org/markup-compatibility/2006" xmlns:m="http://schemas.openxmlformats.org/officeDocument/2006/math" xmlns:aink="http://schemas.microsoft.com/office/drawing/2016/ink" xmlns:am3d="http://schemas.microsoft.com/office/drawing/2017/model3d" xmlns:oel="http://schemas.microsoft.com/office/2019/extlst" xmlns:r="http://schemas.openxmlformats.org/officeDocument/2006/relationships" xmlns:wp14="http://schemas.microsoft.com/office/word/2010/wordprocessingDrawing" xmlns:wp="http://schemas.openxmlformats.org/drawingml/2006/wordprocessingDrawing" xmlns:wpg="http://schemas.microsoft.com/office/word/2010/wordprocessingGroup" xmlns:wpi="http://schemas.microsoft.com/office/word/2010/wordprocessingInk" xmlns:wps="http://schemas.microsoft.com/office/word/2010/wordprocessingShape" xmlns:o="urn:schemas-microsoft-com:office:office" xmlns:v="urn:schemas-microsoft-com:vml" xmlns:w10="urn:schemas-microsoft-com:office:word" xmlns:w="http://schemas.openxmlformats.org/wordprocessingml/2006/main" xmlns:w14="http://schemas.microsoft.com/office/word/2010/wordml" xmlns:w15="http://schemas.microsoft.com/office/word/2012/wordml" xmlns:w16cex="http://schemas.microsoft.com/office/word/2018/wordml/cex" xmlns:w16cid="http://schemas.microsoft.com/office/word/2016/wordml/cid" xmlns:w16="http://schemas.microsoft.com/office/word/2018/wordml" xmlns:w16sdtdh="http://schemas.microsoft.com/office/word/2020/wordml/sdtdatahash" xmlns:w16sdtfl="http://schemas.microsoft.com/office/word/2024/wordml/sdtformatlock" xmlns:w16se="http://schemas.microsoft.com/office/word/2015/wordml/symex" xmlns:w16du="http://schemas.microsoft.com/office/word/2023/wordml/word16du" xmlns:wne="http://schemas.microsoft.com/office/word/2006/wordml" mc:Ignorable="w14 w15 w16se w16cid w16 w16cex w16sdtdh w16sdtfl w16du wp14">
   <w:abstractNum w:abstractNumId="0" w15:restartNumberingAfterBreak="0">
     <w:nsid w:val="12307C65"/>
     <w:multiLevelType w:val="hybridMultilevel"/>
@@ -4087,7 +4179,7 @@
 </file>
 
 <file path=word/styles.xml><?xml version="1.0" encoding="utf-8"?>
-<w:styles xmlns:mc="http://schemas.openxmlformats.org/markup-compatibility/2006" xmlns:r="http://schemas.openxmlformats.org/officeDocument/2006/relationships" xmlns:w="http://schemas.openxmlformats.org/wordprocessingml/2006/main" xmlns:w14="http://schemas.microsoft.com/office/word/2010/wordml" xmlns:w15="http://schemas.microsoft.com/office/word/2012/wordml" xmlns:w16cex="http://schemas.microsoft.com/office/word/2018/wordml/cex" xmlns:w16cid="http://schemas.microsoft.com/office/word/2016/wordml/cid" xmlns:w16="http://schemas.microsoft.com/office/word/2018/wordml" xmlns:w16du="http://schemas.microsoft.com/office/word/2023/wordml/word16du" xmlns:w16sdtdh="http://schemas.microsoft.com/office/word/2020/wordml/sdtdatahash" xmlns:w16sdtfl="http://schemas.microsoft.com/office/word/2024/wordml/sdtformatlock" xmlns:w16se="http://schemas.microsoft.com/office/word/2015/wordml/symex" mc:Ignorable="w14 w15 w16se w16cid w16 w16cex w16sdtdh w16sdtfl w16du">
+<w:styles xmlns:mc="http://schemas.openxmlformats.org/markup-compatibility/2006" xmlns:r="http://schemas.openxmlformats.org/officeDocument/2006/relationships" xmlns:w="http://schemas.openxmlformats.org/wordprocessingml/2006/main" xmlns:w14="http://schemas.microsoft.com/office/word/2010/wordml" xmlns:w15="http://schemas.microsoft.com/office/word/2012/wordml" xmlns:w16cex="http://schemas.microsoft.com/office/word/2018/wordml/cex" xmlns:w16cid="http://schemas.microsoft.com/office/word/2016/wordml/cid" xmlns:w16="http://schemas.microsoft.com/office/word/2018/wordml" xmlns:w16sdtdh="http://schemas.microsoft.com/office/word/2020/wordml/sdtdatahash" xmlns:w16sdtfl="http://schemas.microsoft.com/office/word/2024/wordml/sdtformatlock" xmlns:w16se="http://schemas.microsoft.com/office/word/2015/wordml/symex" xmlns:w16du="http://schemas.microsoft.com/office/word/2023/wordml/word16du" mc:Ignorable="w14 w15 w16se w16cid w16 w16cex w16sdtdh w16sdtfl w16du">
   <w:docDefaults>
     <w:rPrDefault>
       <w:rPr>

</xml_diff>

<commit_message>
fix(docx): preserve duplicate paragraphs in textboxes (#4606)
* fix(msword): preserve duplicate paragraphs in textboxes by skipping mc:Fallback branch

Signed-off-by: Cesar Berrospi Ramis <ceb@zurich.ibm.com>

* style(docx): improve code style

Signed-off-by: Cesar Berrospi Ramis <ceb@zurich.ibm.com>

---------

Signed-off-by: Cesar Berrospi Ramis <ceb@zurich.ibm.com>
</commit_message>
<xml_diff>
--- a/tests/data/docx/sources/textbox.docx
+++ b/tests/data/docx/sources/textbox.docx
@@ -1,6 +1,6 @@
 
 <file path=word/document.xml><?xml version="1.0" encoding="utf-8"?>
-<w:document xmlns:wpc="http://schemas.microsoft.com/office/word/2010/wordprocessingCanvas" xmlns:cx="http://schemas.microsoft.com/office/drawing/2014/chartex" xmlns:cx1="http://schemas.microsoft.com/office/drawing/2015/9/8/chartex" xmlns:cx2="http://schemas.microsoft.com/office/drawing/2015/10/21/chartex" xmlns:cx3="http://schemas.microsoft.com/office/drawing/2016/5/9/chartex" xmlns:cx4="http://schemas.microsoft.com/office/drawing/2016/5/10/chartex" xmlns:cx5="http://schemas.microsoft.com/office/drawing/2016/5/11/chartex" xmlns:cx6="http://schemas.microsoft.com/office/drawing/2016/5/12/chartex" xmlns:cx7="http://schemas.microsoft.com/office/drawing/2016/5/13/chartex" xmlns:cx8="http://schemas.microsoft.com/office/drawing/2016/5/14/chartex" xmlns:mc="http://schemas.openxmlformats.org/markup-compatibility/2006" xmlns:aink="http://schemas.microsoft.com/office/drawing/2016/ink" xmlns:am3d="http://schemas.microsoft.com/office/drawing/2017/model3d" xmlns:o="urn:schemas-microsoft-com:office:office" xmlns:oel="http://schemas.microsoft.com/office/2019/extlst" xmlns:r="http://schemas.openxmlformats.org/officeDocument/2006/relationships" xmlns:m="http://schemas.openxmlformats.org/officeDocument/2006/math" xmlns:v="urn:schemas-microsoft-com:vml" xmlns:wp14="http://schemas.microsoft.com/office/word/2010/wordprocessingDrawing" xmlns:wp="http://schemas.openxmlformats.org/drawingml/2006/wordprocessingDrawing" xmlns:w10="urn:schemas-microsoft-com:office:word" xmlns:w="http://schemas.openxmlformats.org/wordprocessingml/2006/main" xmlns:w14="http://schemas.microsoft.com/office/word/2010/wordml" xmlns:w15="http://schemas.microsoft.com/office/word/2012/wordml" xmlns:w16cex="http://schemas.microsoft.com/office/word/2018/wordml/cex" xmlns:w16cid="http://schemas.microsoft.com/office/word/2016/wordml/cid" xmlns:w16="http://schemas.microsoft.com/office/word/2018/wordml" xmlns:w16du="http://schemas.microsoft.com/office/word/2023/wordml/word16du" xmlns:w16sdtdh="http://schemas.microsoft.com/office/word/2020/wordml/sdtdatahash" xmlns:w16sdtfl="http://schemas.microsoft.com/office/word/2024/wordml/sdtformatlock" xmlns:w16se="http://schemas.microsoft.com/office/word/2015/wordml/symex" xmlns:wpg="http://schemas.microsoft.com/office/word/2010/wordprocessingGroup" xmlns:wpi="http://schemas.microsoft.com/office/word/2010/wordprocessingInk" xmlns:wne="http://schemas.microsoft.com/office/word/2006/wordml" xmlns:wps="http://schemas.microsoft.com/office/word/2010/wordprocessingShape" mc:Ignorable="w14 w15 w16se w16cid w16 w16cex w16sdtdh w16sdtfl w16du wp14">
+<w:document xmlns:wpc="http://schemas.microsoft.com/office/word/2010/wordprocessingCanvas" xmlns:cx="http://schemas.microsoft.com/office/drawing/2014/chartex" xmlns:cx1="http://schemas.microsoft.com/office/drawing/2015/9/8/chartex" xmlns:cx2="http://schemas.microsoft.com/office/drawing/2015/10/21/chartex" xmlns:cx3="http://schemas.microsoft.com/office/drawing/2016/5/9/chartex" xmlns:cx4="http://schemas.microsoft.com/office/drawing/2016/5/10/chartex" xmlns:cx5="http://schemas.microsoft.com/office/drawing/2016/5/11/chartex" xmlns:cx6="http://schemas.microsoft.com/office/drawing/2016/5/12/chartex" xmlns:cx7="http://schemas.microsoft.com/office/drawing/2016/5/13/chartex" xmlns:cx8="http://schemas.microsoft.com/office/drawing/2016/5/14/chartex" xmlns:mc="http://schemas.openxmlformats.org/markup-compatibility/2006" xmlns:m="http://schemas.openxmlformats.org/officeDocument/2006/math" xmlns:aink="http://schemas.microsoft.com/office/drawing/2016/ink" xmlns:am3d="http://schemas.microsoft.com/office/drawing/2017/model3d" xmlns:oel="http://schemas.microsoft.com/office/2019/extlst" xmlns:r="http://schemas.openxmlformats.org/officeDocument/2006/relationships" xmlns:wp14="http://schemas.microsoft.com/office/word/2010/wordprocessingDrawing" xmlns:wp="http://schemas.openxmlformats.org/drawingml/2006/wordprocessingDrawing" xmlns:wpg="http://schemas.microsoft.com/office/word/2010/wordprocessingGroup" xmlns:wpi="http://schemas.microsoft.com/office/word/2010/wordprocessingInk" xmlns:wps="http://schemas.microsoft.com/office/word/2010/wordprocessingShape" xmlns:o="urn:schemas-microsoft-com:office:office" xmlns:v="urn:schemas-microsoft-com:vml" xmlns:w10="urn:schemas-microsoft-com:office:word" xmlns:w="http://schemas.openxmlformats.org/wordprocessingml/2006/main" xmlns:w14="http://schemas.microsoft.com/office/word/2010/wordml" xmlns:w15="http://schemas.microsoft.com/office/word/2012/wordml" xmlns:w16cex="http://schemas.microsoft.com/office/word/2018/wordml/cex" xmlns:w16cid="http://schemas.microsoft.com/office/word/2016/wordml/cid" xmlns:w16="http://schemas.microsoft.com/office/word/2018/wordml" xmlns:w16sdtdh="http://schemas.microsoft.com/office/word/2020/wordml/sdtdatahash" xmlns:w16sdtfl="http://schemas.microsoft.com/office/word/2024/wordml/sdtformatlock" xmlns:w16se="http://schemas.microsoft.com/office/word/2015/wordml/symex" xmlns:w16du="http://schemas.microsoft.com/office/word/2023/wordml/word16du" xmlns:wne="http://schemas.microsoft.com/office/word/2006/wordml" mc:Ignorable="w14 w15 w16se w16cid w16 w16cex w16sdtdh w16sdtfl w16du wp14">
   <w:body>
     <w:p>
       <w:pPr>
@@ -17,25 +17,7 @@
           <w:b/>
           <w:bCs/>
         </w:rPr>
-        <w:t xml:space="preserve">Chiayi County </w:t>
-      </w:r>
-      <w:proofErr w:type="spellStart"/>
-      <w:r>
-        <w:rPr>
-          <w:rFonts w:eastAsia="DFKai-SB"/>
-          <w:b/>
-          <w:bCs/>
-        </w:rPr>
-        <w:t>Shuishang</w:t>
-      </w:r>
-      <w:proofErr w:type="spellEnd"/>
-      <w:r>
-        <w:rPr>
-          <w:rFonts w:eastAsia="DFKai-SB"/>
-          <w:b/>
-          <w:bCs/>
-        </w:rPr>
-        <w:t xml:space="preserve"> Township Nanjing Elementary School Affiliated Kindergarten</w:t>
+        <w:t>Chiayi County Shuishang Township Nanjing Elementary School Affiliated Kindergarten</w:t>
       </w:r>
     </w:p>
     <w:p>
@@ -116,7 +98,6 @@
                               <w:rPr>
                                 <w:rFonts w:eastAsia="Times New Roman"/>
                                 <w:kern w:val="0"/>
-                                <w:lang/>
                               </w:rPr>
                             </w:pPr>
                             <w:r>
@@ -125,7 +106,6 @@
                                 <w:b/>
                                 <w:bCs/>
                                 <w:kern w:val="0"/>
-                                <w:lang/>
                               </w:rPr>
                               <w:t>Student falls il</w:t>
                             </w:r>
@@ -135,7 +115,6 @@
                                 <w:b/>
                                 <w:bCs/>
                                 <w:kern w:val="0"/>
-                                <w:lang/>
                               </w:rPr>
                               <w:t>l</w:t>
                             </w:r>
@@ -1011,14 +990,12 @@
                               <w:rPr>
                                 <w:rFonts w:eastAsia="Times New Roman"/>
                                 <w:kern w:val="0"/>
-                                <w:lang/>
                               </w:rPr>
                             </w:pPr>
                             <w:r>
                               <w:rPr>
                                 <w:rFonts w:eastAsia="Times New Roman"/>
                                 <w:kern w:val="0"/>
-                                <w:lang/>
                               </w:rPr>
                               <w:t>A report must be submitted within 24 hours via the Ministry of Education’s Campus Safety and Disaster Prevention Information Network.</w:t>
                             </w:r>
@@ -1035,14 +1012,12 @@
                               <w:rPr>
                                 <w:rFonts w:eastAsia="Times New Roman"/>
                                 <w:kern w:val="0"/>
-                                <w:lang/>
                               </w:rPr>
                             </w:pPr>
                             <w:r>
                               <w:rPr>
                                 <w:rFonts w:eastAsia="Times New Roman"/>
                                 <w:kern w:val="0"/>
-                                <w:lang/>
                               </w:rPr>
                               <w:t>A report must also be submitted within 48 hours through Chiayi County’s School Suspected Infectious Disease Reporting System.</w:t>
                             </w:r>
@@ -1053,7 +1028,6 @@
                                 <w:rFonts w:ascii="DFKai-SB" w:eastAsia="DFKai-SB" w:hAnsi="DFKai-SB"/>
                                 <w:sz w:val="20"/>
                                 <w:szCs w:val="20"/>
-                                <w:lang/>
                               </w:rPr>
                             </w:pPr>
                           </w:p>
@@ -1292,7 +1266,6 @@
                               <w:rPr>
                                 <w:rFonts w:eastAsia="Times New Roman"/>
                                 <w:kern w:val="0"/>
-                                <w:lang/>
                               </w:rPr>
                             </w:pPr>
                             <w:r>
@@ -1301,7 +1274,6 @@
                                 <w:b/>
                                 <w:bCs/>
                                 <w:kern w:val="0"/>
-                                <w:lang/>
                               </w:rPr>
                               <w:t>Health Bureau:</w:t>
                             </w:r>
@@ -1313,14 +1285,12 @@
                               <w:rPr>
                                 <w:rFonts w:eastAsia="Times New Roman"/>
                                 <w:kern w:val="0"/>
-                                <w:lang/>
                               </w:rPr>
                             </w:pPr>
                             <w:r>
                               <w:rPr>
                                 <w:rFonts w:eastAsia="Times New Roman"/>
                                 <w:kern w:val="0"/>
-                                <w:lang/>
                               </w:rPr>
                               <w:t>Upon receiving a report from the kindergarten, conduct a preliminary assessment of the case, and depending on the situation and type of illness, carry out an epidemiological investigation and report to the Centers for Disease Control.</w:t>
                             </w:r>
@@ -1336,14 +1306,12 @@
                               <w:rPr>
                                 <w:rFonts w:eastAsia="Times New Roman"/>
                                 <w:kern w:val="0"/>
-                                <w:lang/>
                               </w:rPr>
                             </w:pPr>
                             <w:r>
                               <w:rPr>
                                 <w:rFonts w:eastAsia="Times New Roman"/>
                                 <w:kern w:val="0"/>
-                                <w:lang/>
                               </w:rPr>
                               <w:t>If necessary, provide health education and important reminders at the kindergarten, or notify the individual to undergo specimen collection.</w:t>
                             </w:r>
@@ -1359,14 +1327,12 @@
                               <w:rPr>
                                 <w:rFonts w:eastAsia="Times New Roman"/>
                                 <w:kern w:val="0"/>
-                                <w:lang/>
                               </w:rPr>
                             </w:pPr>
                             <w:r>
                               <w:rPr>
                                 <w:rFonts w:eastAsia="Times New Roman"/>
                                 <w:kern w:val="0"/>
-                                <w:lang/>
                               </w:rPr>
                               <w:t>Implement appropriate epidemic prevention measures in accordance with the Communicable Disease Control Act.</w:t>
                             </w:r>
@@ -1375,7 +1341,6 @@
                             <w:pPr>
                               <w:rPr>
                                 <w:rFonts w:ascii="DFKai-SB" w:eastAsia="DFKai-SB" w:hAnsi="DFKai-SB"/>
-                                <w:lang/>
                               </w:rPr>
                             </w:pPr>
                           </w:p>
@@ -1767,14 +1732,12 @@
                               <w:rPr>
                                 <w:rFonts w:eastAsia="Times New Roman"/>
                                 <w:kern w:val="0"/>
-                                <w:lang/>
                               </w:rPr>
                             </w:pPr>
                             <w:r>
                               <w:rPr>
                                 <w:rFonts w:eastAsia="Times New Roman"/>
                                 <w:kern w:val="0"/>
-                                <w:lang/>
                               </w:rPr>
                               <w:t xml:space="preserve">The Health Bureau will handle </w:t>
                             </w:r>
@@ -1784,7 +1747,6 @@
                                 <w:b/>
                                 <w:bCs/>
                                 <w:kern w:val="0"/>
-                                <w:lang/>
                               </w:rPr>
                               <w:t>reporting and specimen collection</w:t>
                             </w:r>
@@ -1792,7 +1754,6 @@
                               <w:rPr>
                                 <w:rFonts w:eastAsia="Times New Roman"/>
                                 <w:kern w:val="0"/>
-                                <w:lang/>
                               </w:rPr>
                               <w:t>.</w:t>
                             </w:r>
@@ -2016,7 +1977,6 @@
                               <w:rPr>
                                 <w:rFonts w:eastAsia="Times New Roman"/>
                                 <w:kern w:val="0"/>
-                                <w:lang/>
                               </w:rPr>
                             </w:pPr>
                             <w:r>
@@ -2025,7 +1985,6 @@
                                 <w:b/>
                                 <w:bCs/>
                                 <w:kern w:val="0"/>
-                                <w:lang/>
                               </w:rPr>
                               <w:t>Whether the epidemic has eased.</w:t>
                             </w:r>
@@ -2155,7 +2114,6 @@
                               <w:rPr>
                                 <w:rFonts w:eastAsia="Times New Roman"/>
                                 <w:kern w:val="0"/>
-                                <w:lang/>
                               </w:rPr>
                             </w:pPr>
                             <w:r>
@@ -2164,7 +2122,6 @@
                                 <w:b/>
                                 <w:bCs/>
                                 <w:kern w:val="0"/>
-                                <w:lang/>
                               </w:rPr>
                               <w:t>Whether the test results are positive for a legally designated infectious disease.</w:t>
                             </w:r>
@@ -2903,7 +2860,6 @@
                               <w:rPr>
                                 <w:rFonts w:eastAsia="Times New Roman"/>
                                 <w:kern w:val="0"/>
-                                <w:lang/>
                               </w:rPr>
                             </w:pPr>
                             <w:r>
@@ -2912,7 +2868,6 @@
                                 <w:b/>
                                 <w:bCs/>
                                 <w:kern w:val="0"/>
-                                <w:lang/>
                               </w:rPr>
                               <w:t>Case closed.</w:t>
                             </w:r>
@@ -3312,6 +3267,143 @@
     </w:p>
     <w:p>
       <w:pPr>
+        <w:widowControl/>
+        <w:rPr>
+          <w:rFonts w:ascii="DFKai-SB" w:eastAsia="DFKai-SB" w:hAnsi="DFKai-SB"/>
+          <w:sz w:val="34"/>
+          <w:szCs w:val="34"/>
+        </w:rPr>
+      </w:pPr>
+      <w:r>
+        <w:rPr>
+          <w:rFonts w:ascii="DFKai-SB" w:eastAsia="DFKai-SB" w:hAnsi="DFKai-SB"/>
+          <w:sz w:val="34"/>
+          <w:szCs w:val="34"/>
+        </w:rPr>
+        <w:br w:type="page"/>
+      </w:r>
+    </w:p>
+    <w:p>
+      <w:r>
+        <w:rPr>
+          <w:noProof/>
+        </w:rPr>
+        <w:lastRenderedPageBreak/>
+        <mc:AlternateContent>
+          <mc:Choice Requires="wps">
+            <w:drawing>
+              <wp:anchor distT="0" distB="0" distL="114300" distR="114300" simplePos="0" relativeHeight="251678720" behindDoc="0" locked="0" layoutInCell="1" allowOverlap="1" wp14:anchorId="1B357CA6" wp14:editId="6DFBBB6D">
+                <wp:simplePos x="0" y="0"/>
+                <wp:positionH relativeFrom="column">
+                  <wp:posOffset>370205</wp:posOffset>
+                </wp:positionH>
+                <wp:positionV relativeFrom="paragraph">
+                  <wp:posOffset>370205</wp:posOffset>
+                </wp:positionV>
+                <wp:extent cx="4445000" cy="1270000"/>
+                <wp:effectExtent l="0" t="0" r="12700" b="25400"/>
+                <wp:wrapNone/>
+                <wp:docPr id="913353322" name="Zone de texte 1"/>
+                <wp:cNvGraphicFramePr/>
+                <a:graphic xmlns:a="http://schemas.openxmlformats.org/drawingml/2006/main">
+                  <a:graphicData uri="http://schemas.microsoft.com/office/word/2010/wordprocessingShape">
+                    <wps:wsp>
+                      <wps:cNvSpPr txBox="1"/>
+                      <wps:spPr>
+                        <a:xfrm>
+                          <a:off x="0" y="0"/>
+                          <a:ext cx="4445000" cy="1270000"/>
+                        </a:xfrm>
+                        <a:prstGeom prst="rect">
+                          <a:avLst/>
+                        </a:prstGeom>
+                        <a:noFill/>
+                        <a:ln w="6350">
+                          <a:solidFill>
+                            <a:prstClr val="black"/>
+                          </a:solidFill>
+                        </a:ln>
+                      </wps:spPr>
+                      <wps:txbx>
+                        <w:txbxContent>
+                          <w:p>
+                            <w:r>
+                              <w:t>SAME_LINE_INSIDE_BOX</w:t>
+                            </w:r>
+                          </w:p>
+                          <w:p>
+                            <w:r>
+                              <w:t>MIDDLE_DIFFERENT_LINE</w:t>
+                            </w:r>
+                          </w:p>
+                          <w:p>
+                            <w:r>
+                              <w:t>SAME_LINE_INSIDE_BOX</w:t>
+                            </w:r>
+                          </w:p>
+                        </w:txbxContent>
+                      </wps:txbx>
+                      <wps:bodyPr rot="0" spcFirstLastPara="0" vertOverflow="overflow" horzOverflow="overflow" vert="horz" wrap="square" lIns="91440" tIns="45720" rIns="91440" bIns="45720" numCol="1" spcCol="0" rtlCol="0" fromWordArt="0" anchor="t" anchorCtr="0" forceAA="0" compatLnSpc="1">
+                        <a:prstTxWarp prst="textNoShape">
+                          <a:avLst/>
+                        </a:prstTxWarp>
+                        <a:noAutofit/>
+                      </wps:bodyPr>
+                    </wps:wsp>
+                  </a:graphicData>
+                </a:graphic>
+              </wp:anchor>
+            </w:drawing>
+          </mc:Choice>
+          <mc:Fallback>
+            <w:pict>
+              <v:shapetype w14:anchorId="1B357CA6" id="_x0000_t202" coordsize="21600,21600" o:spt="202" path="m,l,21600r21600,l21600,xe">
+                <v:stroke joinstyle="miter"/>
+                <v:path gradientshapeok="t" o:connecttype="rect"/>
+              </v:shapetype>
+              <v:shape id="Zone de texte 1" o:spid="_x0000_s1042" type="#_x0000_t202" style="position:absolute;margin-left:29.15pt;margin-top:29.15pt;width:350pt;height:100pt;z-index:251678720;visibility:visible;mso-wrap-style:square;mso-wrap-distance-left:9pt;mso-wrap-distance-top:0;mso-wrap-distance-right:9pt;mso-wrap-distance-bottom:0;mso-position-horizontal:absolute;mso-position-horizontal-relative:text;mso-position-vertical:absolute;mso-position-vertical-relative:text;v-text-anchor:top" o:gfxdata="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" filled="f" strokeweight=".5pt">
+                <v:textbox>
+                  <w:txbxContent>
+                    <w:p>
+                      <w:r>
+                        <w:t>SAME_LINE_INSIDE_BOX</w:t>
+                      </w:r>
+                    </w:p>
+                    <w:p>
+                      <w:r>
+                        <w:t>MIDDLE_DIFFERENT_LINE</w:t>
+                      </w:r>
+                    </w:p>
+                    <w:p>
+                      <w:r>
+                        <w:t>SAME_LINE_INSIDE_BOX</w:t>
+                      </w:r>
+                    </w:p>
+                  </w:txbxContent>
+                </v:textbox>
+              </v:shape>
+            </w:pict>
+          </mc:Fallback>
+        </mc:AlternateContent>
+      </w:r>
+      <w:r>
+        <w:t>Body paragraph before textbox</w:t>
+      </w:r>
+    </w:p>
+    <w:p/>
+    <w:p/>
+    <w:p/>
+    <w:p/>
+    <w:p/>
+    <w:p/>
+    <w:p/>
+    <w:p>
+      <w:r>
+        <w:t>Body paragraph after textbox</w:t>
+      </w:r>
+    </w:p>
+    <w:p>
+      <w:pPr>
         <w:rPr>
           <w:rFonts w:ascii="DFKai-SB" w:eastAsia="DFKai-SB" w:hAnsi="DFKai-SB"/>
           <w:sz w:val="34"/>
@@ -3330,7 +3422,7 @@
 </file>
 
 <file path=word/numbering.xml><?xml version="1.0" encoding="utf-8"?>
-<w:numbering xmlns:wpc="http://schemas.microsoft.com/office/word/2010/wordprocessingCanvas" xmlns:cx="http://schemas.microsoft.com/office/drawing/2014/chartex" xmlns:cx1="http://schemas.microsoft.com/office/drawing/2015/9/8/chartex" xmlns:cx2="http://schemas.microsoft.com/office/drawing/2015/10/21/chartex" xmlns:cx3="http://schemas.microsoft.com/office/drawing/2016/5/9/chartex" xmlns:cx4="http://schemas.microsoft.com/office/drawing/2016/5/10/chartex" xmlns:cx5="http://schemas.microsoft.com/office/drawing/2016/5/11/chartex" xmlns:cx6="http://schemas.microsoft.com/office/drawing/2016/5/12/chartex" xmlns:cx7="http://schemas.microsoft.com/office/drawing/2016/5/13/chartex" xmlns:cx8="http://schemas.microsoft.com/office/drawing/2016/5/14/chartex" xmlns:mc="http://schemas.openxmlformats.org/markup-compatibility/2006" xmlns:aink="http://schemas.microsoft.com/office/drawing/2016/ink" xmlns:am3d="http://schemas.microsoft.com/office/drawing/2017/model3d" xmlns:o="urn:schemas-microsoft-com:office:office" xmlns:oel="http://schemas.microsoft.com/office/2019/extlst" xmlns:r="http://schemas.openxmlformats.org/officeDocument/2006/relationships" xmlns:m="http://schemas.openxmlformats.org/officeDocument/2006/math" xmlns:v="urn:schemas-microsoft-com:vml" xmlns:wp14="http://schemas.microsoft.com/office/word/2010/wordprocessingDrawing" xmlns:wp="http://schemas.openxmlformats.org/drawingml/2006/wordprocessingDrawing" xmlns:w10="urn:schemas-microsoft-com:office:word" xmlns:w="http://schemas.openxmlformats.org/wordprocessingml/2006/main" xmlns:w14="http://schemas.microsoft.com/office/word/2010/wordml" xmlns:w15="http://schemas.microsoft.com/office/word/2012/wordml" xmlns:w16cex="http://schemas.microsoft.com/office/word/2018/wordml/cex" xmlns:w16cid="http://schemas.microsoft.com/office/word/2016/wordml/cid" xmlns:w16="http://schemas.microsoft.com/office/word/2018/wordml" xmlns:w16du="http://schemas.microsoft.com/office/word/2023/wordml/word16du" xmlns:w16sdtdh="http://schemas.microsoft.com/office/word/2020/wordml/sdtdatahash" xmlns:w16sdtfl="http://schemas.microsoft.com/office/word/2024/wordml/sdtformatlock" xmlns:w16se="http://schemas.microsoft.com/office/word/2015/wordml/symex" xmlns:wpg="http://schemas.microsoft.com/office/word/2010/wordprocessingGroup" xmlns:wpi="http://schemas.microsoft.com/office/word/2010/wordprocessingInk" xmlns:wne="http://schemas.microsoft.com/office/word/2006/wordml" xmlns:wps="http://schemas.microsoft.com/office/word/2010/wordprocessingShape" mc:Ignorable="w14 w15 w16se w16cid w16 w16cex w16sdtdh w16sdtfl w16du wp14">
+<w:numbering xmlns:wpc="http://schemas.microsoft.com/office/word/2010/wordprocessingCanvas" xmlns:cx="http://schemas.microsoft.com/office/drawing/2014/chartex" xmlns:cx1="http://schemas.microsoft.com/office/drawing/2015/9/8/chartex" xmlns:cx2="http://schemas.microsoft.com/office/drawing/2015/10/21/chartex" xmlns:cx3="http://schemas.microsoft.com/office/drawing/2016/5/9/chartex" xmlns:cx4="http://schemas.microsoft.com/office/drawing/2016/5/10/chartex" xmlns:cx5="http://schemas.microsoft.com/office/drawing/2016/5/11/chartex" xmlns:cx6="http://schemas.microsoft.com/office/drawing/2016/5/12/chartex" xmlns:cx7="http://schemas.microsoft.com/office/drawing/2016/5/13/chartex" xmlns:cx8="http://schemas.microsoft.com/office/drawing/2016/5/14/chartex" xmlns:mc="http://schemas.openxmlformats.org/markup-compatibility/2006" xmlns:m="http://schemas.openxmlformats.org/officeDocument/2006/math" xmlns:aink="http://schemas.microsoft.com/office/drawing/2016/ink" xmlns:am3d="http://schemas.microsoft.com/office/drawing/2017/model3d" xmlns:oel="http://schemas.microsoft.com/office/2019/extlst" xmlns:r="http://schemas.openxmlformats.org/officeDocument/2006/relationships" xmlns:wp14="http://schemas.microsoft.com/office/word/2010/wordprocessingDrawing" xmlns:wp="http://schemas.openxmlformats.org/drawingml/2006/wordprocessingDrawing" xmlns:wpg="http://schemas.microsoft.com/office/word/2010/wordprocessingGroup" xmlns:wpi="http://schemas.microsoft.com/office/word/2010/wordprocessingInk" xmlns:wps="http://schemas.microsoft.com/office/word/2010/wordprocessingShape" xmlns:o="urn:schemas-microsoft-com:office:office" xmlns:v="urn:schemas-microsoft-com:vml" xmlns:w10="urn:schemas-microsoft-com:office:word" xmlns:w="http://schemas.openxmlformats.org/wordprocessingml/2006/main" xmlns:w14="http://schemas.microsoft.com/office/word/2010/wordml" xmlns:w15="http://schemas.microsoft.com/office/word/2012/wordml" xmlns:w16cex="http://schemas.microsoft.com/office/word/2018/wordml/cex" xmlns:w16cid="http://schemas.microsoft.com/office/word/2016/wordml/cid" xmlns:w16="http://schemas.microsoft.com/office/word/2018/wordml" xmlns:w16sdtdh="http://schemas.microsoft.com/office/word/2020/wordml/sdtdatahash" xmlns:w16sdtfl="http://schemas.microsoft.com/office/word/2024/wordml/sdtformatlock" xmlns:w16se="http://schemas.microsoft.com/office/word/2015/wordml/symex" xmlns:w16du="http://schemas.microsoft.com/office/word/2023/wordml/word16du" xmlns:wne="http://schemas.microsoft.com/office/word/2006/wordml" mc:Ignorable="w14 w15 w16se w16cid w16 w16cex w16sdtdh w16sdtfl w16du wp14">
   <w:abstractNum w:abstractNumId="0" w15:restartNumberingAfterBreak="0">
     <w:nsid w:val="12307C65"/>
     <w:multiLevelType w:val="hybridMultilevel"/>
@@ -4087,7 +4179,7 @@
 </file>
 
 <file path=word/styles.xml><?xml version="1.0" encoding="utf-8"?>
-<w:styles xmlns:mc="http://schemas.openxmlformats.org/markup-compatibility/2006" xmlns:r="http://schemas.openxmlformats.org/officeDocument/2006/relationships" xmlns:w="http://schemas.openxmlformats.org/wordprocessingml/2006/main" xmlns:w14="http://schemas.microsoft.com/office/word/2010/wordml" xmlns:w15="http://schemas.microsoft.com/office/word/2012/wordml" xmlns:w16cex="http://schemas.microsoft.com/office/word/2018/wordml/cex" xmlns:w16cid="http://schemas.microsoft.com/office/word/2016/wordml/cid" xmlns:w16="http://schemas.microsoft.com/office/word/2018/wordml" xmlns:w16du="http://schemas.microsoft.com/office/word/2023/wordml/word16du" xmlns:w16sdtdh="http://schemas.microsoft.com/office/word/2020/wordml/sdtdatahash" xmlns:w16sdtfl="http://schemas.microsoft.com/office/word/2024/wordml/sdtformatlock" xmlns:w16se="http://schemas.microsoft.com/office/word/2015/wordml/symex" mc:Ignorable="w14 w15 w16se w16cid w16 w16cex w16sdtdh w16sdtfl w16du">
+<w:styles xmlns:mc="http://schemas.openxmlformats.org/markup-compatibility/2006" xmlns:r="http://schemas.openxmlformats.org/officeDocument/2006/relationships" xmlns:w="http://schemas.openxmlformats.org/wordprocessingml/2006/main" xmlns:w14="http://schemas.microsoft.com/office/word/2010/wordml" xmlns:w15="http://schemas.microsoft.com/office/word/2012/wordml" xmlns:w16cex="http://schemas.microsoft.com/office/word/2018/wordml/cex" xmlns:w16cid="http://schemas.microsoft.com/office/word/2016/wordml/cid" xmlns:w16="http://schemas.microsoft.com/office/word/2018/wordml" xmlns:w16sdtdh="http://schemas.microsoft.com/office/word/2020/wordml/sdtdatahash" xmlns:w16sdtfl="http://schemas.microsoft.com/office/word/2024/wordml/sdtformatlock" xmlns:w16se="http://schemas.microsoft.com/office/word/2015/wordml/symex" xmlns:w16du="http://schemas.microsoft.com/office/word/2023/wordml/word16du" mc:Ignorable="w14 w15 w16se w16cid w16 w16cex w16sdtdh w16sdtfl w16du">
   <w:docDefaults>
     <w:rPrDefault>
       <w:rPr>

</xml_diff>